<commit_message>
Let the jury into the parent section: demo PIN and PIN recovery
- Demo profile accepts the fixed PIN 1234 (AppController.demoParentPin),
  shown on the unlock sheet; the real PIN keeps working. PIN change and
  biometrics are hidden in demo so the demo PIN cannot touch the real
  parent access.
- If no PIN is stored (Android restored app data without the encrypted
  PIN, or an older profile), the unlock sheet asks for a new PIN instead
  of locking the parent out forever.
- README, docs and the deck list the PIN for the jury; new tests cover
  both paths.

Co-Authored-By: Claude Opus 5.5 <noreply@anthropic.com>
</commit_message>
<xml_diff>
--- a/docs/Документация_Финансовый_питомец.docx
+++ b/docs/Документация_Финансовый_питомец.docx
@@ -747,7 +747,7 @@
               <w:rPr>
                 <w:sz w:val="19"/>
               </w:rPr>
-              <w:t>24 файла автотестов (427 тестов)</w:t>
+              <w:t>24 файла автотестов (430 тестов)</w:t>
             </w:r>
           </w:p>
         </w:tc>
@@ -1311,7 +1311,27 @@
         <w:rPr>
           <w:color w:val="08154B"/>
         </w:rPr>
-        <w:t>2.4. Установка без среды разработки</w:t>
+        <w:t>2.4. Установка без среды разработки и тестовые данные</w:t>
+      </w:r>
+    </w:p>
+    <w:p>
+      <w:r>
+        <w:rPr>
+          <w:b/>
+        </w:rPr>
+        <w:t>PIN раздела для родителей:</w:t>
+      </w:r>
+      <w:r>
+        <w:t xml:space="preserve"> в демо-профиле — </w:t>
+      </w:r>
+      <w:r>
+        <w:rPr>
+          <w:b/>
+        </w:rPr>
+        <w:t>1234</w:t>
+      </w:r>
+      <w:r>
+        <w:t xml:space="preserve"> (подсказка на экране входа, работает только в демо-режиме); в обычном профиле — PIN, заданный при первом запуске (для проверки рекомендуем 1234). Если PIN на устройстве отсутствует (восстановление данных из резервной копии Android), экран входа предлагает задать новый.</w:t>
       </w:r>
     </w:p>
     <w:p>
@@ -1361,7 +1381,7 @@
         </w:rPr>
         <w:t>dart analyze lib test   # статический анализ, 0 замечаний</w:t>
         <w:br/>
-        <w:t>flutter test            # 427 автотестов</w:t>
+        <w:t>flutter test            # 430 автотестов</w:t>
       </w:r>
     </w:p>
     <w:p>
@@ -4498,7 +4518,7 @@
               <w:rPr>
                 <w:sz w:val="19"/>
               </w:rPr>
-              <w:t xml:space="preserve"> (PIN 4–6 цифр или биометрия)</w:t>
+              <w:t xml:space="preserve"> (PIN 4–6 цифр или биометрия; в демо — PIN 1234)</w:t>
             </w:r>
           </w:p>
         </w:tc>
@@ -7784,7 +7804,7 @@
         <w:rPr>
           <w:b/>
         </w:rPr>
-        <w:t>427 тестов, все проходят</w:t>
+        <w:t>430 тестов, все проходят</w:t>
       </w:r>
       <w:r>
         <w:t xml:space="preserve"> (сборка 1.0.0+1). Покрывают: экономику (баланс, траты, копилка, цели, запрет минуса), план бюджета, рост питомца, игровые периоды и демо-режим, сохранение и восстановление, журнал операций, магазин, события, родительский доступ, анимации и основные экраны.</w:t>
@@ -8699,6 +8719,122 @@
                 <w:sz w:val="19"/>
               </w:rPr>
               <w:t>adult_dashboard_test.dart</w:t>
+            </w:r>
+          </w:p>
+        </w:tc>
+      </w:tr>
+      <w:tr>
+        <w:tc>
+          <w:tcPr>
+            <w:tcW w:type="dxa" w:w="2493"/>
+          </w:tcPr>
+          <w:p>
+            <w:r>
+              <w:rPr>
+                <w:sz w:val="19"/>
+              </w:rPr>
+              <w:t>ТК-14</w:t>
+            </w:r>
+          </w:p>
+        </w:tc>
+        <w:tc>
+          <w:tcPr>
+            <w:tcW w:type="dxa" w:w="2493"/>
+          </w:tcPr>
+          <w:p>
+            <w:r>
+              <w:rPr>
+                <w:sz w:val="19"/>
+              </w:rPr>
+              <w:t>Демо-режим → «Для родителей» → PIN 1234</w:t>
+            </w:r>
+          </w:p>
+        </w:tc>
+        <w:tc>
+          <w:tcPr>
+            <w:tcW w:type="dxa" w:w="2493"/>
+          </w:tcPr>
+          <w:p>
+            <w:r>
+              <w:rPr>
+                <w:sz w:val="19"/>
+              </w:rPr>
+              <w:t>Подсказка «Демо-режим: PIN 1234», раздел открывается; смены PIN и биометрии нет</w:t>
+            </w:r>
+          </w:p>
+        </w:tc>
+        <w:tc>
+          <w:tcPr>
+            <w:tcW w:type="dxa" w:w="2493"/>
+          </w:tcPr>
+          <w:p>
+            <w:r>
+              <w:rPr>
+                <w:sz w:val="19"/>
+              </w:rPr>
+              <w:t xml:space="preserve">Вручную, эмулятор; </w:t>
+            </w:r>
+            <w:r>
+              <w:rPr>
+                <w:rFonts w:ascii="Consolas" w:hAnsi="Consolas"/>
+                <w:sz w:val="19"/>
+              </w:rPr>
+              <w:t>parent_access_test.dart</w:t>
+            </w:r>
+          </w:p>
+        </w:tc>
+      </w:tr>
+      <w:tr>
+        <w:tc>
+          <w:tcPr>
+            <w:tcW w:type="dxa" w:w="2493"/>
+          </w:tcPr>
+          <w:p>
+            <w:r>
+              <w:rPr>
+                <w:sz w:val="19"/>
+              </w:rPr>
+              <w:t>ТК-15</w:t>
+            </w:r>
+          </w:p>
+        </w:tc>
+        <w:tc>
+          <w:tcPr>
+            <w:tcW w:type="dxa" w:w="2493"/>
+          </w:tcPr>
+          <w:p>
+            <w:r>
+              <w:rPr>
+                <w:sz w:val="19"/>
+              </w:rPr>
+              <w:t>PIN отсутствует на устройстве → «Для родителей»</w:t>
+            </w:r>
+          </w:p>
+        </w:tc>
+        <w:tc>
+          <w:tcPr>
+            <w:tcW w:type="dxa" w:w="2493"/>
+          </w:tcPr>
+          <w:p>
+            <w:r>
+              <w:rPr>
+                <w:sz w:val="19"/>
+              </w:rPr>
+              <w:t>Предложение задать новый PIN, после ввода раздел открывается</w:t>
+            </w:r>
+          </w:p>
+        </w:tc>
+        <w:tc>
+          <w:tcPr>
+            <w:tcW w:type="dxa" w:w="2493"/>
+          </w:tcPr>
+          <w:p>
+            <w:r>
+              <w:rPr>
+                <w:rFonts w:ascii="Consolas" w:hAnsi="Consolas"/>
+                <w:sz w:val="19"/>
+              </w:rPr>
+              <w:t>parent_access_test.dart</w:t>
             </w:r>
           </w:p>
         </w:tc>

</xml_diff>

<commit_message>
Point docs to the FinTrix repo and drop the empty asset folder
- README, docs, deck and its PDF/DOCX now link to VavilonK/FinTrix and
  cd into the FinTrix folder after cloning.
- pubspec.yaml no longer lists assets/icons/navigation/: the folder is
  empty, git does not keep it, so a fresh clone printed "unable to find
  directory entry" during the build.

Co-Authored-By: Claude Opus 5.5 <noreply@anthropic.com>
</commit_message>
<xml_diff>
--- a/docs/Документация_Финансовый_питомец.docx
+++ b/docs/Документация_Финансовый_питомец.docx
@@ -265,7 +265,7 @@
               <w:rPr>
                 <w:sz w:val="19"/>
               </w:rPr>
-              <w:t>https://github.com/VavilonK/Hackathon</w:t>
+              <w:t>https://github.com/VavilonK/FinTrix</w:t>
             </w:r>
           </w:p>
         </w:tc>
@@ -1125,9 +1125,9 @@
           <w:rFonts w:ascii="Consolas" w:hAnsi="Consolas"/>
           <w:sz w:val="18"/>
         </w:rPr>
-        <w:t>git clone https://github.com/VavilonK/Hackathon.git</w:t>
+        <w:t>git clone https://github.com/VavilonK/FinTrix.git</w:t>
         <w:br/>
-        <w:t>cd Hackathon</w:t>
+        <w:t>cd FinTrix</w:t>
         <w:br/>
         <w:t>flutter pub get</w:t>
         <w:br/>

</xml_diff>